<commit_message>
docs: cap nhat Sprint Planning 1-3 va Product Backlog cho khop thuc te
US-13 'Done' -> chuyen Sprint 3; Sprint 3: US-13, US-14, US-15 ve To Do (chua co ma nguon). Cot cong nghe theo thuc te (node:test, Expo, Playwright, Maestro). Product Backlog them cot Sprint/Story, trang thai, ghi chu; sua ten bi dich may (ghi lai ten cu); Sprint Backlog: US-26 lam som, muc 'Ngoai ke hoach'.

Co-Authored-By: Claude Opus 5.5 <noreply@anthropic.com>
</commit_message>
<xml_diff>
--- a/docs/Sprint_Planning_1.docx
+++ b/docs/Sprint_Planning_1.docx
@@ -2844,7 +2844,7 @@
                 <w:u w:val="none"/>
                 <w:lang w:val="en-US" w:eastAsia="zh-CN" w:bidi="ar"/>
               </w:rPr>
-              <w:t>Git, GitHub, ESLint, Prettier, Husky, Conventional Commits</w:t>
+              <w:t>Git, GitHub, ESLint, Prettier, Conventional Commits</w:t>
             </w:r>
           </w:p>
         </w:tc>
@@ -3532,7 +3532,7 @@
                 <w:u w:val="none"/>
                 <w:lang w:val="en-US" w:eastAsia="zh-CN" w:bidi="ar"/>
               </w:rPr>
-              <w:t>draw.io, MongoDB Compass</w:t>
+              <w:t>Mermaid (docs/ERD.md)</w:t>
             </w:r>
           </w:p>
         </w:tc>
@@ -3876,7 +3876,7 @@
                 <w:u w:val="none"/>
                 <w:lang w:val="en-US" w:eastAsia="zh-CN" w:bidi="ar"/>
               </w:rPr>
-              <w:t>Mongoose 8, mongodb-memory-server, @faker-js/faker</w:t>
+              <w:t>Mongoose 8, @faker-js/faker</w:t>
             </w:r>
           </w:p>
         </w:tc>
@@ -4908,7 +4908,7 @@
                 <w:u w:val="none"/>
                 <w:lang w:val="en-US" w:eastAsia="zh-CN" w:bidi="ar"/>
               </w:rPr>
-              <w:t>swagger-jsdoc, swagger-ui-express, http-status-codes</w:t>
+              <w:t>swagger-jsdoc, swagger-ui-express</w:t>
             </w:r>
           </w:p>
         </w:tc>
@@ -5255,7 +5255,7 @@
                 <w:u w:val="none"/>
                 <w:lang w:val="en-US" w:eastAsia="zh-CN" w:bidi="ar"/>
               </w:rPr>
-              <w:t>Jest, Supertest, Postman, GitHub Actions</w:t>
+              <w:t>node:test, Supertest, Postman</w:t>
             </w:r>
           </w:p>
         </w:tc>
@@ -5288,7 +5288,7 @@
           <w:sz w:val="18"/>
           <w:szCs w:val="18"/>
         </w:rPr>
-        <w:t>Chuỗi phụ thuộc là một đường thẳng T1 → T2 → T3 → T4 → T5 → T6 → T7 → T8. Do một người thực hiện nên không có Task nào chạy song song, và một Task trễ sẽ kéo toàn bộ chuỗi phía sau trễ theo</w:t>
+        <w:t>Chuỗi phụ thuộc là một đường thẳng T1 → T2 → T3 → T4 → T5 → T6 → T7 → T8. Do một người thực hiện nên không có Task nào chạy song song, và một Task trễ sẽ kéo toàn bộ chuỗi phía sau trễ theo. Xét riêng phụ thuộc kỹ thuật thì T3 chỉ cần T1 và T7 chỉ cần T2: sơ đồ PERT (PERT_Sprint1_Sprint2.docx) cho đường găng T1 → T3 → T4 → T5 → T6 → T8 dài 6,0 ngày, nhưng tổng công một người làm là 7,5 ngày &gt; 7 ngày của Sprint.</w:t>
       </w:r>
     </w:p>
     <w:p>
@@ -5339,7 +5339,7 @@
         <w:t>Rủi ro</w:t>
       </w:r>
       <w:r>
-        <w:t xml:space="preserve"> : MongoDB chạy nhiều tài liệu ở chế độ độc lập không được hỗ trợ. Phát hiện hiện tại sẽ làm sai số liệu ở dịch vụ thu hộ và đối kháng tại Sprint 5. </w:t>
+        <w:t xml:space="preserve"> : MongoDB chạy ở chế độ độc lập (standalone) không hỗ trợ transaction nhiều document. Phát hiện muộn sẽ làm sai số liệu ở chức năng thu hộ và đối soát tại Sprint 5.</w:t>
       </w:r>
     </w:p>
     <w:p>
@@ -5362,16 +5362,7 @@
         <w:t>Biện pháp</w:t>
       </w:r>
       <w:r>
-        <w:t xml:space="preserve"> : cấu hình bản sao thiết lập một nút ngay trong </w:t>
-      </w:r>
-      <w:r>
-        <w:rPr>
-          <w:rStyle w:val="5"/>
-        </w:rPr>
-        <w:t>docker-compose.yml</w:t>
-      </w:r>
-      <w:r>
-        <w:t>T2; viết một giao dịch thử nghiệm ở T8 để xác nhận hoạt động trước khi kết thúc Sprint.</w:t>
+        <w:t xml:space="preserve"> : cấu hình replica set một nút ngay trong docker-compose.yml (T2); viết một test transaction ở T8 để xác nhận hoạt động trước khi kết thúc Sprint.</w:t>
       </w:r>
     </w:p>
     <w:p>
@@ -5408,7 +5399,7 @@
         <w:t>Rủi ro</w:t>
       </w:r>
       <w:r>
-        <w:t xml:space="preserve"> : sai sót lược đồ thiết kế ở đầu dự án mở rộng sửa đổi ở Sprint sau. </w:t>
+        <w:t xml:space="preserve"> : sai sót trong lược đồ dữ liệu thiết kế ở đầu dự án sẽ kéo theo sửa đổi lớn ở các Sprint sau.</w:t>
       </w:r>
     </w:p>
     <w:p>
@@ -5431,7 +5422,7 @@
         <w:t>Biện pháp</w:t>
       </w:r>
       <w:r>
-        <w:t xml:space="preserve"> : dành T3 để vẽ sơ đồ thực thi trước khi viết bất kỳ mã dòng nào; chốt sẵn 4 chỉ mục bắt buộc và quy tắc nhúng hay tham chiếu cho từng bộ sưu tập.</w:t>
+        <w:t xml:space="preserve"> : dành T3 để vẽ sơ đồ thực thể trước khi viết dòng mã nào; chốt sẵn 4 chỉ mục bắt buộc và quy tắc nhúng hay tham chiếu cho từng collection.</w:t>
       </w:r>
     </w:p>
     <w:p>
@@ -5527,7 +5518,7 @@
         <w:t>Rủi ro</w:t>
       </w:r>
       <w:r>
-        <w:t xml:space="preserve"> : toàn bộ Nhiệm vụ chạy tuần tự, không có phòng dự phòng nếu có Nhiệm vụ vượt quá số lượng. </w:t>
+        <w:t xml:space="preserve"> : toàn bộ task chạy tuần tự, không có thời gian dự phòng nếu một task vượt ước lượng.</w:t>
       </w:r>
     </w:p>
     <w:p>
@@ -5550,7 +5541,7 @@
         <w:t>Biện pháp</w:t>
       </w:r>
       <w:r>
-        <w:t xml:space="preserve"> : ưu tiên hoàn thành T1 đến T6 vì đây là các phần phụ thuộc của Sprint; if thiếu thời gian thì T7 được phép lùi sang Sprint 2.</w:t>
+        <w:t xml:space="preserve"> : ưu tiên hoàn thành T1 đến T6 vì các Sprint sau phụ thuộc vào chúng; nếu thiếu thời gian thì T7 được phép lùi sang Sprint 2.</w:t>
       </w:r>
     </w:p>
     <w:p>
@@ -5586,7 +5577,7 @@
         <w:t>Rủi ro</w:t>
       </w:r>
       <w:r>
-        <w:t xml:space="preserve"> : Sprint không có người dùng cuối câu chuyện hướng dẫn nên khó chứng minh giá trị tại Sprint Review. </w:t>
+        <w:t xml:space="preserve"> : Sprint không có user story hướng người dùng cuối nên khó chứng minh giá trị tại Sprint Review.</w:t>
       </w:r>
     </w:p>
     <w:p>
@@ -5606,10 +5597,10 @@
         <w:rPr>
           <w:rStyle w:val="7"/>
         </w:rPr>
-        <w:t>Giải pháp</w:t>
+        <w:t>Biện pháp</w:t>
       </w:r>
       <w:r>
-        <w:t xml:space="preserve"> : chuẩn bị thu thập Postman chạy đủ luồng đăng ký, đăng nhập và gọi API xác thực; demo giao diện Swagger UI trực tiếp.</w:t>
+        <w:t xml:space="preserve"> : chuẩn bị Postman collection chạy đủ luồng đăng ký, đăng nhập và gọi API có xác thực; demo trực tiếp trên Swagger UI.</w:t>
       </w:r>
     </w:p>
     <w:p>
@@ -6331,6 +6322,166 @@
           </w:p>
         </w:tc>
       </w:tr>
+      <w:tr>
+        <w:tblPrEx>
+          <w:tblBorders>
+            <w:top w:val="none" w:color="auto" w:sz="0" w:space="0"/>
+            <w:left w:val="none" w:color="auto" w:sz="0" w:space="0"/>
+            <w:bottom w:val="none" w:color="auto" w:sz="0" w:space="0"/>
+            <w:right w:val="none" w:color="auto" w:sz="0" w:space="0"/>
+            <w:insideH w:val="none" w:color="auto" w:sz="0" w:space="0"/>
+            <w:insideV w:val="none" w:color="auto" w:sz="0" w:space="0"/>
+          </w:tblBorders>
+          <w:shd w:val="clear" w:color="auto" w:fill="auto"/>
+          <w:tblCellMar>
+            <w:top w:w="0" w:type="dxa"/>
+            <w:left w:w="108" w:type="dxa"/>
+            <w:bottom w:w="0" w:type="dxa"/>
+            <w:right w:w="108" w:type="dxa"/>
+          </w:tblCellMar>
+        </w:tblPrEx>
+        <w:trPr>
+          <w:trHeight w:val="1728" w:hRule="atLeast"/>
+        </w:trPr>
+        <w:tc>
+          <w:tcPr>
+            <w:tcW w:w="1428" w:type="dxa"/>
+            <w:tcBorders>
+              <w:top w:val="single" w:color="000000" w:sz="4" w:space="0"/>
+              <w:left w:val="single" w:color="000000" w:sz="4" w:space="0"/>
+              <w:bottom w:val="single" w:color="000000" w:sz="4" w:space="0"/>
+              <w:right w:val="single" w:color="000000" w:sz="4" w:space="0"/>
+            </w:tcBorders>
+            <w:shd w:val="clear" w:color="auto" w:fill="auto"/>
+            <w:vAlign w:val="center"/>
+          </w:tcPr>
+          <w:p>
+            <w:pPr>
+              <w:keepNext w:val="0"/>
+              <w:keepLines w:val="0"/>
+              <w:widowControl/>
+              <w:suppressLineNumbers w:val="0"/>
+              <w:jc w:val="left"/>
+              <w:textAlignment w:val="center"/>
+              <w:rPr>
+                <w:rFonts w:hint="default" w:ascii="Calibri" w:hAnsi="Calibri" w:cs="Calibri"/>
+                <w:i w:val="0"/>
+                <w:iCs w:val="0"/>
+                <w:color w:val="000000"/>
+                <w:sz w:val="22"/>
+                <w:szCs w:val="22"/>
+                <w:u w:val="none"/>
+              </w:rPr>
+            </w:pPr>
+            <w:r>
+              <w:rPr>
+                <w:rFonts w:hint="default" w:ascii="Calibri" w:hAnsi="Calibri" w:eastAsia="SimSun" w:cs="Calibri"/>
+                <w:i w:val="0"/>
+                <w:iCs w:val="0"/>
+                <w:color w:val="000000"/>
+                <w:kern w:val="0"/>
+                <w:sz w:val="22"/>
+                <w:szCs w:val="22"/>
+                <w:u w:val="none"/>
+                <w:lang w:val="en-US" w:eastAsia="zh-CN" w:bidi="ar"/>
+              </w:rPr>
+              <w:t>T3 — Sơ đồ ERD</w:t>
+            </w:r>
+          </w:p>
+        </w:tc>
+        <w:tc>
+          <w:tcPr>
+            <w:tcW w:w="1272" w:type="dxa"/>
+            <w:tcBorders>
+              <w:top w:val="single" w:color="000000" w:sz="4" w:space="0"/>
+              <w:left w:val="single" w:color="000000" w:sz="4" w:space="0"/>
+              <w:bottom w:val="single" w:color="000000" w:sz="4" w:space="0"/>
+              <w:right w:val="single" w:color="000000" w:sz="4" w:space="0"/>
+            </w:tcBorders>
+            <w:shd w:val="clear" w:color="auto" w:fill="auto"/>
+            <w:vAlign w:val="center"/>
+          </w:tcPr>
+          <w:p>
+            <w:pPr>
+              <w:keepNext w:val="0"/>
+              <w:keepLines w:val="0"/>
+              <w:widowControl/>
+              <w:suppressLineNumbers w:val="0"/>
+              <w:jc w:val="left"/>
+              <w:textAlignment w:val="center"/>
+              <w:rPr>
+                <w:rFonts w:hint="default" w:ascii="Calibri" w:hAnsi="Calibri" w:cs="Calibri"/>
+                <w:i w:val="0"/>
+                <w:iCs w:val="0"/>
+                <w:color w:val="000000"/>
+                <w:sz w:val="22"/>
+                <w:szCs w:val="22"/>
+                <w:u w:val="none"/>
+              </w:rPr>
+            </w:pPr>
+            <w:r>
+              <w:rPr>
+                <w:rFonts w:hint="default" w:ascii="Calibri" w:hAnsi="Calibri" w:eastAsia="SimSun" w:cs="Calibri"/>
+                <w:i w:val="0"/>
+                <w:iCs w:val="0"/>
+                <w:color w:val="000000"/>
+                <w:kern w:val="0"/>
+                <w:sz w:val="22"/>
+                <w:szCs w:val="22"/>
+                <w:u w:val="none"/>
+                <w:lang w:val="en-US" w:eastAsia="zh-CN" w:bidi="ar"/>
+              </w:rPr>
+              <w:t>Hoàn thành 07/09/2026</w:t>
+            </w:r>
+          </w:p>
+        </w:tc>
+        <w:tc>
+          <w:tcPr>
+            <w:tcW w:w="1896" w:type="dxa"/>
+            <w:tcBorders>
+              <w:top w:val="single" w:color="000000" w:sz="4" w:space="0"/>
+              <w:left w:val="single" w:color="000000" w:sz="4" w:space="0"/>
+              <w:bottom w:val="single" w:color="000000" w:sz="4" w:space="0"/>
+              <w:right w:val="single" w:color="000000" w:sz="4" w:space="0"/>
+            </w:tcBorders>
+            <w:shd w:val="clear" w:color="auto" w:fill="auto"/>
+            <w:vAlign w:val="center"/>
+          </w:tcPr>
+          <w:p>
+            <w:pPr>
+              <w:keepNext w:val="0"/>
+              <w:keepLines w:val="0"/>
+              <w:widowControl/>
+              <w:suppressLineNumbers w:val="0"/>
+              <w:jc w:val="left"/>
+              <w:textAlignment w:val="center"/>
+              <w:rPr>
+                <w:rFonts w:hint="default" w:ascii="Calibri" w:hAnsi="Calibri" w:cs="Calibri"/>
+                <w:i w:val="0"/>
+                <w:iCs w:val="0"/>
+                <w:color w:val="000000"/>
+                <w:sz w:val="22"/>
+                <w:szCs w:val="22"/>
+                <w:u w:val="none"/>
+              </w:rPr>
+            </w:pPr>
+            <w:r>
+              <w:rPr>
+                <w:rFonts w:hint="default" w:ascii="Calibri" w:hAnsi="Calibri" w:eastAsia="SimSun" w:cs="Calibri"/>
+                <w:i w:val="0"/>
+                <w:iCs w:val="0"/>
+                <w:color w:val="000000"/>
+                <w:kern w:val="0"/>
+                <w:sz w:val="22"/>
+                <w:szCs w:val="22"/>
+                <w:u w:val="none"/>
+                <w:lang w:val="en-US" w:eastAsia="zh-CN" w:bidi="ar"/>
+              </w:rPr>
+              <w:t>Thiết kế chốt đúng hạn; sơ đồ hình bổ sung sau (docs/ERD.md)</w:t>
+            </w:r>
+          </w:p>
+        </w:tc>
+      </w:tr>
     </w:tbl>
     <w:p/>
     <w:p/>
@@ -6359,59 +6510,7 @@
         <w:t>Lý do cập nhật</w:t>
       </w:r>
       <w:r>
-        <w:t xml:space="preserve"> : số bộ sưu tập thực tế cần thiết kế là 12, nhiều hơn số lượng ban đầu, khiến US-02 vượt quá 1 điểm và kết thúc sau một ngày. Phần mềm này tiến tới US-03 và US-04. </w:t>
-      </w:r>
-      <w:r>
-        <w:rPr>
-          <w:rFonts w:hint="default" w:eastAsia="SimSun" w:cs="Segoe UI Variable Display Semibold" w:asciiTheme="minorAscii" w:hAnsiTheme="minorAscii"/>
-          <w:b w:val="0"/>
-          <w:bCs w:val="0"/>
-          <w:sz w:val="24"/>
-          <w:szCs w:val="24"/>
-        </w:rPr>
-        <w:t>Sprint v</w:t>
-      </w:r>
-      <w:r>
-        <w:rPr>
-          <w:rFonts w:hint="default" w:eastAsia="SimSun" w:cs="Segoe UI Variable Display Semibold" w:asciiTheme="minorAscii" w:hAnsiTheme="minorAscii"/>
-          <w:b w:val="0"/>
-          <w:bCs w:val="0"/>
-          <w:sz w:val="24"/>
-          <w:szCs w:val="24"/>
-          <w:lang w:val="en-US"/>
-        </w:rPr>
-        <w:t>ẫn</w:t>
-      </w:r>
-      <w:r>
-        <w:rPr>
-          <w:rFonts w:hint="default" w:eastAsia="SimSun" w:cs="Segoe UI Variable Display Semibold" w:asciiTheme="minorAscii" w:hAnsiTheme="minorAscii"/>
-          <w:b w:val="0"/>
-          <w:bCs w:val="0"/>
-          <w:sz w:val="24"/>
-          <w:szCs w:val="24"/>
-        </w:rPr>
-        <w:t xml:space="preserve">n hoàn thành đủ 16 điểm cam kết </w:t>
-      </w:r>
-      <w:r>
-        <w:rPr>
-          <w:rStyle w:val="7"/>
-          <w:rFonts w:hint="default" w:eastAsia="SimSun" w:cs="Segoe UI Variable Display Semibold" w:asciiTheme="minorAscii" w:hAnsiTheme="minorAscii"/>
-          <w:b w:val="0"/>
-          <w:bCs w:val="0"/>
-          <w:sz w:val="24"/>
-          <w:szCs w:val="24"/>
-        </w:rPr>
-        <w:t>nhờ</w:t>
-      </w:r>
-      <w:r>
-        <w:rPr>
-          <w:rFonts w:hint="default" w:eastAsia="SimSun" w:cs="Segoe UI Variable Display Semibold" w:asciiTheme="minorAscii" w:hAnsiTheme="minorAscii"/>
-          <w:b w:val="0"/>
-          <w:bCs w:val="0"/>
-          <w:sz w:val="24"/>
-          <w:szCs w:val="24"/>
-        </w:rPr>
-        <w:t xml:space="preserve"> làm thêm giờ ngày 11/09/2026</w:t>
+        <w:t xml:space="preserve"> : số collection thực tế cần thiết kế là 12, nhiều hơn dự kiến ban đầu, khiến US-02 vượt 1 điểm và kết thúc muộn một ngày. Phần vượt đẩy lùi US-03 và US-04. Sprint vẫn hoàn thành đủ 16 điểm cam kết nhờ làm thêm giờ ngày 11/09/2026.</w:t>
       </w:r>
     </w:p>
     <w:p>
@@ -6434,7 +6533,30 @@
         <w:t>Bài học cho Sprint 2</w:t>
       </w:r>
       <w:r>
-        <w:t xml:space="preserve"> : ước lượng ở tầng thiết kế dữ liệu và tầng nghiệp vụ đang thiếu. Từ Sprint 2, Story liên quan đến dữ liệu cấu trúc thiết kế hoặc quy tắc phân quyền nhiều cấp được cộng hệ số 1,2 khi ước lượng.</w:t>
+        <w:t xml:space="preserve"> : ước lượng ở tầng thiết kế dữ liệu và tầng nghiệp vụ đang thiếu. Từ Sprint 2, story liên quan đến thiết kế cấu trúc dữ liệu hoặc quy tắc phân quyền nhiều cấp được nhân hệ số 1,2 khi ước lượng.</w:t>
+      </w:r>
+    </w:p>
+    <w:p>
+      <w:pPr>
+        <w:keepNext w:val="0"/>
+        <w:keepLines w:val="0"/>
+        <w:widowControl/>
+        <w:numPr>
+          <w:ilvl w:val="0"/>
+          <w:numId w:val="4"/>
+        </w:numPr>
+        <w:suppressLineNumbers w:val="0"/>
+        <w:spacing w:before="0" w:beforeAutospacing="1" w:after="0" w:afterAutospacing="1"/>
+        <w:ind w:left="720" w:hanging="360"/>
+      </w:pPr>
+      <w:r>
+        <w:rPr>
+          <w:rStyle w:val="7"/>
+        </w:rPr>
+        <w:t>Cập nhật 29/10/2026 — đối chiếu mã nguồn</w:t>
+      </w:r>
+      <w:r>
+        <w:t xml:space="preserve"> : sơ đồ ERD (T3) — thiết kế 12 collection đã chốt và hiện thực trong model đúng hạn, nhưng sơ đồ hình được đưa vào repository sau (docs/ERD.md). Công nghệ thực tế khác kế hoạch: kiểm thử dùng node:test + Supertest thay cho Jest, chạy trên MongoDB replica set thật trong Docker thay cho mongodb-memory-server; không dùng Husky và http-status-codes; GitHub Actions thuộc US-05 (Sprint 2). Cột “Công nghệ / tool / thư viện” ở bảng phân công đã sửa theo thực tế. Mã nguồn Sprint 1: nhánh sprint-1 trên GitHub.</w:t>
       </w:r>
     </w:p>
     <w:p/>

</xml_diff>